<commit_message>
Cleanup project structure, consolidate docs, and streamline build workflow
</commit_message>
<xml_diff>
--- a/Vorlagen/LEK-Vorlage.docx
+++ b/Vorlagen/LEK-Vorlage.docx
@@ -39,6 +39,7 @@
           <w:lang w:val="de-DE"/>
         </w:rPr>
       </w:pPr>
+      <w:proofErr w:type="spellStart"/>
       <w:r>
         <w:rPr>
           <w:b/>
@@ -47,6 +48,7 @@
         </w:rPr>
         <w:t>TitelFürThema</w:t>
       </w:r>
+      <w:proofErr w:type="spellEnd"/>
     </w:p>
     <w:p>
       <w:pPr>
@@ -316,13 +318,11 @@
         <w:pStyle w:val="berschrift1"/>
         <w:spacing w:before="0"/>
         <w:rPr>
-          <w:color w:val="auto"/>
           <w:lang w:val="de-DE"/>
         </w:rPr>
       </w:pPr>
       <w:r>
         <w:rPr>
-          <w:color w:val="auto"/>
           <w:lang w:val="de-DE"/>
         </w:rPr>
         <w:t>Hinweise zur Bearbeitung</w:t>
@@ -464,13 +464,11 @@
         <w:pStyle w:val="berschrift2"/>
         <w:spacing w:before="0"/>
         <w:rPr>
-          <w:color w:val="auto"/>
           <w:lang w:val="de-DE"/>
         </w:rPr>
       </w:pPr>
       <w:r>
         <w:rPr>
-          <w:color w:val="auto"/>
           <w:lang w:val="de-DE"/>
         </w:rPr>
         <w:t>Bewertungsschema</w:t>
@@ -964,7 +962,15 @@
               </w:rPr>
             </w:pPr>
             <w:r>
-              <w:t>Note 6 (ungenügend)</w:t>
+              <w:t>Note 6 (</w:t>
+            </w:r>
+            <w:proofErr w:type="spellStart"/>
+            <w:r>
+              <w:t>ungenügend</w:t>
+            </w:r>
+            <w:proofErr w:type="spellEnd"/>
+            <w:r>
+              <w:t>)</w:t>
             </w:r>
           </w:p>
         </w:tc>
@@ -1815,12 +1821,12 @@
   <w:style w:type="paragraph" w:default="1" w:styleId="Standard">
     <w:name w:val="Normal"/>
     <w:qFormat/>
-    <w:rsid w:val="00CF7DC3"/>
+    <w:rsid w:val="00D10812"/>
     <w:pPr>
       <w:spacing w:after="0" w:line="264" w:lineRule="auto"/>
     </w:pPr>
     <w:rPr>
-      <w:rFonts w:ascii="Aptos" w:hAnsi="Aptos"/>
+      <w:rFonts w:ascii="Aptos Narrow" w:hAnsi="Aptos Narrow"/>
     </w:rPr>
   </w:style>
   <w:style w:type="paragraph" w:styleId="berschrift1">
@@ -1830,7 +1836,7 @@
     <w:link w:val="berschrift1Zchn"/>
     <w:uiPriority w:val="9"/>
     <w:qFormat/>
-    <w:rsid w:val="00FC693F"/>
+    <w:rsid w:val="00D10812"/>
     <w:pPr>
       <w:keepNext/>
       <w:keepLines/>
@@ -1838,10 +1844,9 @@
       <w:outlineLvl w:val="0"/>
     </w:pPr>
     <w:rPr>
-      <w:rFonts w:asciiTheme="majorHAnsi" w:eastAsiaTheme="majorEastAsia" w:hAnsiTheme="majorHAnsi" w:cstheme="majorBidi"/>
+      <w:rFonts w:eastAsiaTheme="majorEastAsia" w:cstheme="majorBidi"/>
       <w:b/>
       <w:bCs/>
-      <w:color w:val="00A499"/>
       <w:sz w:val="28"/>
       <w:szCs w:val="28"/>
     </w:rPr>
@@ -1854,18 +1859,20 @@
     <w:uiPriority w:val="9"/>
     <w:unhideWhenUsed/>
     <w:qFormat/>
-    <w:rsid w:val="00FC693F"/>
+    <w:rsid w:val="00D10812"/>
     <w:pPr>
       <w:keepNext/>
       <w:keepLines/>
-      <w:spacing w:before="200"/>
+      <w:tabs>
+        <w:tab w:val="right" w:pos="9923"/>
+      </w:tabs>
+      <w:spacing w:before="240"/>
       <w:outlineLvl w:val="1"/>
     </w:pPr>
     <w:rPr>
-      <w:rFonts w:asciiTheme="majorHAnsi" w:eastAsiaTheme="majorEastAsia" w:hAnsiTheme="majorHAnsi" w:cstheme="majorBidi"/>
+      <w:rFonts w:eastAsiaTheme="majorEastAsia" w:cstheme="majorBidi"/>
       <w:b/>
       <w:bCs/>
-      <w:color w:val="00A499"/>
       <w:sz w:val="26"/>
       <w:szCs w:val="26"/>
     </w:rPr>
@@ -2117,12 +2124,11 @@
     <w:basedOn w:val="Absatz-Standardschriftart"/>
     <w:link w:val="berschrift1"/>
     <w:uiPriority w:val="9"/>
-    <w:rsid w:val="00FC693F"/>
+    <w:rsid w:val="00D10812"/>
     <w:rPr>
-      <w:rFonts w:asciiTheme="majorHAnsi" w:eastAsiaTheme="majorEastAsia" w:hAnsiTheme="majorHAnsi" w:cstheme="majorBidi"/>
+      <w:rFonts w:ascii="Aptos Narrow" w:eastAsiaTheme="majorEastAsia" w:hAnsi="Aptos Narrow" w:cstheme="majorBidi"/>
       <w:b/>
       <w:bCs/>
-      <w:color w:val="365F91" w:themeColor="accent1" w:themeShade="BF"/>
       <w:sz w:val="28"/>
       <w:szCs w:val="28"/>
     </w:rPr>
@@ -2132,12 +2138,11 @@
     <w:basedOn w:val="Absatz-Standardschriftart"/>
     <w:link w:val="berschrift2"/>
     <w:uiPriority w:val="9"/>
-    <w:rsid w:val="00FC693F"/>
+    <w:rsid w:val="00D10812"/>
     <w:rPr>
-      <w:rFonts w:asciiTheme="majorHAnsi" w:eastAsiaTheme="majorEastAsia" w:hAnsiTheme="majorHAnsi" w:cstheme="majorBidi"/>
+      <w:rFonts w:ascii="Aptos Narrow" w:eastAsiaTheme="majorEastAsia" w:hAnsi="Aptos Narrow" w:cstheme="majorBidi"/>
       <w:b/>
       <w:bCs/>
-      <w:color w:val="4F81BD" w:themeColor="accent1"/>
       <w:sz w:val="26"/>
       <w:szCs w:val="26"/>
     </w:rPr>

</xml_diff>